<commit_message>
Mark draft notes in bright red in design document template
Co-Authored-By: Claude Opus 5.5 <noreply@anthropic.com>
Claude-Session: https://claude.ai/code/session_01RayYG3bE6Hcjdu95uahmGz
</commit_message>
<xml_diff>
--- a/deliverables/Challenge_Design_Document_Template.docx
+++ b/deliverables/Challenge_Design_Document_Template.docx
@@ -1232,7 +1232,7 @@
           <w:sz w:val="20"/>
           <w:szCs w:val="20"/>
         </w:rPr>
-        <w:t xml:space="preserve">Gray guidance boxes are for the drafter. Delete them before the document goes to the client.</w:t>
+        <w:t xml:space="preserve">Red draft notes are for the drafter. Delete every one before the document goes to the client.</w:t>
       </w:r>
     </w:p>
     <w:p>
@@ -1404,11 +1404,11 @@
             <w:tcW w:type="dxa" w:w="10080"/>
             <w:tcBorders>
               <w:top w:val="none" w:color="FFFFFF" w:sz="0"/>
-              <w:left w:val="single" w:color="4A5059" w:sz="24"/>
+              <w:left w:val="single" w:color="E00000" w:sz="24"/>
               <w:bottom w:val="none" w:color="FFFFFF" w:sz="0"/>
               <w:right w:val="none" w:color="FFFFFF" w:sz="0"/>
             </w:tcBorders>
-            <w:shd w:fill="F2F3F5" w:color="auto" w:val="clear"/>
+            <w:shd w:fill="FFE5E5" w:color="auto" w:val="clear"/>
             <w:tcMar>
               <w:top w:type="dxa" w:w="120"/>
               <w:left w:type="dxa" w:w="180"/>
@@ -1425,12 +1425,12 @@
                 <w:rFonts w:ascii="Arial" w:cs="Arial" w:eastAsia="Arial" w:hAnsi="Arial"/>
                 <w:b/>
                 <w:bCs/>
-                <w:color w:val="4A5059"/>
+                <w:color w:val="E00000"/>
                 <w:spacing w:val="20"/>
                 <w:sz w:val="17"/>
                 <w:szCs w:val="17"/>
               </w:rPr>
-              <w:t xml:space="preserve">GUIDANCE FOR THE DRAFTER · DELETE BEFORE SENDING</w:t>
+              <w:t xml:space="preserve">DRAFT NOTE · DELETE BEFORE SENDING TO CLIENT</w:t>
             </w:r>
           </w:p>
           <w:p>
@@ -1442,7 +1442,7 @@
                 <w:rFonts w:ascii="Arial" w:cs="Arial" w:eastAsia="Arial" w:hAnsi="Arial"/>
                 <w:i/>
                 <w:iCs/>
-                <w:color w:val="4A5059"/>
+                <w:color w:val="E00000"/>
                 <w:sz w:val="19"/>
                 <w:szCs w:val="19"/>
               </w:rPr>
@@ -2243,11 +2243,11 @@
             <w:tcW w:type="dxa" w:w="10080"/>
             <w:tcBorders>
               <w:top w:val="none" w:color="FFFFFF" w:sz="0"/>
-              <w:left w:val="single" w:color="4A5059" w:sz="24"/>
+              <w:left w:val="single" w:color="E00000" w:sz="24"/>
               <w:bottom w:val="none" w:color="FFFFFF" w:sz="0"/>
               <w:right w:val="none" w:color="FFFFFF" w:sz="0"/>
             </w:tcBorders>
-            <w:shd w:fill="F2F3F5" w:color="auto" w:val="clear"/>
+            <w:shd w:fill="FFE5E5" w:color="auto" w:val="clear"/>
             <w:tcMar>
               <w:top w:type="dxa" w:w="120"/>
               <w:left w:type="dxa" w:w="180"/>
@@ -2264,12 +2264,12 @@
                 <w:rFonts w:ascii="Arial" w:cs="Arial" w:eastAsia="Arial" w:hAnsi="Arial"/>
                 <w:b/>
                 <w:bCs/>
-                <w:color w:val="4A5059"/>
+                <w:color w:val="E00000"/>
                 <w:spacing w:val="20"/>
                 <w:sz w:val="17"/>
                 <w:szCs w:val="17"/>
               </w:rPr>
-              <w:t xml:space="preserve">GUIDANCE FOR THE DRAFTER · DELETE BEFORE SENDING</w:t>
+              <w:t xml:space="preserve">DRAFT NOTE · DELETE BEFORE SENDING TO CLIENT</w:t>
             </w:r>
           </w:p>
           <w:p>
@@ -2281,7 +2281,7 @@
                 <w:rFonts w:ascii="Arial" w:cs="Arial" w:eastAsia="Arial" w:hAnsi="Arial"/>
                 <w:i/>
                 <w:iCs/>
-                <w:color w:val="4A5059"/>
+                <w:color w:val="E00000"/>
                 <w:sz w:val="19"/>
                 <w:szCs w:val="19"/>
               </w:rPr>
@@ -2884,11 +2884,11 @@
             <w:tcW w:type="dxa" w:w="10080"/>
             <w:tcBorders>
               <w:top w:val="none" w:color="FFFFFF" w:sz="0"/>
-              <w:left w:val="single" w:color="4A5059" w:sz="24"/>
+              <w:left w:val="single" w:color="E00000" w:sz="24"/>
               <w:bottom w:val="none" w:color="FFFFFF" w:sz="0"/>
               <w:right w:val="none" w:color="FFFFFF" w:sz="0"/>
             </w:tcBorders>
-            <w:shd w:fill="F2F3F5" w:color="auto" w:val="clear"/>
+            <w:shd w:fill="FFE5E5" w:color="auto" w:val="clear"/>
             <w:tcMar>
               <w:top w:type="dxa" w:w="120"/>
               <w:left w:type="dxa" w:w="180"/>
@@ -2905,12 +2905,12 @@
                 <w:rFonts w:ascii="Arial" w:cs="Arial" w:eastAsia="Arial" w:hAnsi="Arial"/>
                 <w:b/>
                 <w:bCs/>
-                <w:color w:val="4A5059"/>
+                <w:color w:val="E00000"/>
                 <w:spacing w:val="20"/>
                 <w:sz w:val="17"/>
                 <w:szCs w:val="17"/>
               </w:rPr>
-              <w:t xml:space="preserve">GUIDANCE FOR THE DRAFTER · DELETE BEFORE SENDING</w:t>
+              <w:t xml:space="preserve">DRAFT NOTE · DELETE BEFORE SENDING TO CLIENT</w:t>
             </w:r>
           </w:p>
           <w:p>
@@ -2922,7 +2922,7 @@
                 <w:rFonts w:ascii="Arial" w:cs="Arial" w:eastAsia="Arial" w:hAnsi="Arial"/>
                 <w:i/>
                 <w:iCs/>
-                <w:color w:val="4A5059"/>
+                <w:color w:val="E00000"/>
                 <w:sz w:val="19"/>
                 <w:szCs w:val="19"/>
               </w:rPr>
@@ -4116,11 +4116,11 @@
             <w:tcW w:type="dxa" w:w="10080"/>
             <w:tcBorders>
               <w:top w:val="none" w:color="FFFFFF" w:sz="0"/>
-              <w:left w:val="single" w:color="4A5059" w:sz="24"/>
+              <w:left w:val="single" w:color="E00000" w:sz="24"/>
               <w:bottom w:val="none" w:color="FFFFFF" w:sz="0"/>
               <w:right w:val="none" w:color="FFFFFF" w:sz="0"/>
             </w:tcBorders>
-            <w:shd w:fill="F2F3F5" w:color="auto" w:val="clear"/>
+            <w:shd w:fill="FFE5E5" w:color="auto" w:val="clear"/>
             <w:tcMar>
               <w:top w:type="dxa" w:w="120"/>
               <w:left w:type="dxa" w:w="180"/>
@@ -4137,12 +4137,12 @@
                 <w:rFonts w:ascii="Arial" w:cs="Arial" w:eastAsia="Arial" w:hAnsi="Arial"/>
                 <w:b/>
                 <w:bCs/>
-                <w:color w:val="4A5059"/>
+                <w:color w:val="E00000"/>
                 <w:spacing w:val="20"/>
                 <w:sz w:val="17"/>
                 <w:szCs w:val="17"/>
               </w:rPr>
-              <w:t xml:space="preserve">GUIDANCE FOR THE DRAFTER · DELETE BEFORE SENDING</w:t>
+              <w:t xml:space="preserve">DRAFT NOTE · DELETE BEFORE SENDING TO CLIENT</w:t>
             </w:r>
           </w:p>
           <w:p>
@@ -4154,7 +4154,7 @@
                 <w:rFonts w:ascii="Arial" w:cs="Arial" w:eastAsia="Arial" w:hAnsi="Arial"/>
                 <w:i/>
                 <w:iCs/>
-                <w:color w:val="4A5059"/>
+                <w:color w:val="E00000"/>
                 <w:sz w:val="19"/>
                 <w:szCs w:val="19"/>
               </w:rPr>
@@ -5230,11 +5230,11 @@
             <w:tcW w:type="dxa" w:w="10080"/>
             <w:tcBorders>
               <w:top w:val="none" w:color="FFFFFF" w:sz="0"/>
-              <w:left w:val="single" w:color="4A5059" w:sz="24"/>
+              <w:left w:val="single" w:color="E00000" w:sz="24"/>
               <w:bottom w:val="none" w:color="FFFFFF" w:sz="0"/>
               <w:right w:val="none" w:color="FFFFFF" w:sz="0"/>
             </w:tcBorders>
-            <w:shd w:fill="F2F3F5" w:color="auto" w:val="clear"/>
+            <w:shd w:fill="FFE5E5" w:color="auto" w:val="clear"/>
             <w:tcMar>
               <w:top w:type="dxa" w:w="120"/>
               <w:left w:type="dxa" w:w="180"/>
@@ -5251,12 +5251,12 @@
                 <w:rFonts w:ascii="Arial" w:cs="Arial" w:eastAsia="Arial" w:hAnsi="Arial"/>
                 <w:b/>
                 <w:bCs/>
-                <w:color w:val="4A5059"/>
+                <w:color w:val="E00000"/>
                 <w:spacing w:val="20"/>
                 <w:sz w:val="17"/>
                 <w:szCs w:val="17"/>
               </w:rPr>
-              <w:t xml:space="preserve">GUIDANCE FOR THE DRAFTER · DELETE BEFORE SENDING</w:t>
+              <w:t xml:space="preserve">DRAFT NOTE · DELETE BEFORE SENDING TO CLIENT</w:t>
             </w:r>
           </w:p>
           <w:p>
@@ -5268,7 +5268,7 @@
                 <w:rFonts w:ascii="Arial" w:cs="Arial" w:eastAsia="Arial" w:hAnsi="Arial"/>
                 <w:i/>
                 <w:iCs/>
-                <w:color w:val="4A5059"/>
+                <w:color w:val="E00000"/>
                 <w:sz w:val="19"/>
                 <w:szCs w:val="19"/>
               </w:rPr>
@@ -5805,11 +5805,11 @@
             <w:tcW w:type="dxa" w:w="10080"/>
             <w:tcBorders>
               <w:top w:val="none" w:color="FFFFFF" w:sz="0"/>
-              <w:left w:val="single" w:color="4A5059" w:sz="24"/>
+              <w:left w:val="single" w:color="E00000" w:sz="24"/>
               <w:bottom w:val="none" w:color="FFFFFF" w:sz="0"/>
               <w:right w:val="none" w:color="FFFFFF" w:sz="0"/>
             </w:tcBorders>
-            <w:shd w:fill="F2F3F5" w:color="auto" w:val="clear"/>
+            <w:shd w:fill="FFE5E5" w:color="auto" w:val="clear"/>
             <w:tcMar>
               <w:top w:type="dxa" w:w="120"/>
               <w:left w:type="dxa" w:w="180"/>
@@ -5826,12 +5826,12 @@
                 <w:rFonts w:ascii="Arial" w:cs="Arial" w:eastAsia="Arial" w:hAnsi="Arial"/>
                 <w:b/>
                 <w:bCs/>
-                <w:color w:val="4A5059"/>
+                <w:color w:val="E00000"/>
                 <w:spacing w:val="20"/>
                 <w:sz w:val="17"/>
                 <w:szCs w:val="17"/>
               </w:rPr>
-              <w:t xml:space="preserve">GUIDANCE FOR THE DRAFTER · DELETE BEFORE SENDING</w:t>
+              <w:t xml:space="preserve">DRAFT NOTE · DELETE BEFORE SENDING TO CLIENT</w:t>
             </w:r>
           </w:p>
           <w:p>
@@ -5843,7 +5843,7 @@
                 <w:rFonts w:ascii="Arial" w:cs="Arial" w:eastAsia="Arial" w:hAnsi="Arial"/>
                 <w:i/>
                 <w:iCs/>
-                <w:color w:val="4A5059"/>
+                <w:color w:val="E00000"/>
                 <w:sz w:val="19"/>
                 <w:szCs w:val="19"/>
               </w:rPr>
@@ -6838,11 +6838,11 @@
             <w:tcW w:type="dxa" w:w="10080"/>
             <w:tcBorders>
               <w:top w:val="none" w:color="FFFFFF" w:sz="0"/>
-              <w:left w:val="single" w:color="4A5059" w:sz="24"/>
+              <w:left w:val="single" w:color="E00000" w:sz="24"/>
               <w:bottom w:val="none" w:color="FFFFFF" w:sz="0"/>
               <w:right w:val="none" w:color="FFFFFF" w:sz="0"/>
             </w:tcBorders>
-            <w:shd w:fill="F2F3F5" w:color="auto" w:val="clear"/>
+            <w:shd w:fill="FFE5E5" w:color="auto" w:val="clear"/>
             <w:tcMar>
               <w:top w:type="dxa" w:w="120"/>
               <w:left w:type="dxa" w:w="180"/>
@@ -6859,12 +6859,12 @@
                 <w:rFonts w:ascii="Arial" w:cs="Arial" w:eastAsia="Arial" w:hAnsi="Arial"/>
                 <w:b/>
                 <w:bCs/>
-                <w:color w:val="4A5059"/>
+                <w:color w:val="E00000"/>
                 <w:spacing w:val="20"/>
                 <w:sz w:val="17"/>
                 <w:szCs w:val="17"/>
               </w:rPr>
-              <w:t xml:space="preserve">GUIDANCE FOR THE DRAFTER · DELETE BEFORE SENDING</w:t>
+              <w:t xml:space="preserve">DRAFT NOTE · DELETE BEFORE SENDING TO CLIENT</w:t>
             </w:r>
           </w:p>
           <w:p>
@@ -6876,7 +6876,7 @@
                 <w:rFonts w:ascii="Arial" w:cs="Arial" w:eastAsia="Arial" w:hAnsi="Arial"/>
                 <w:i/>
                 <w:iCs/>
-                <w:color w:val="4A5059"/>
+                <w:color w:val="E00000"/>
                 <w:sz w:val="19"/>
                 <w:szCs w:val="19"/>
               </w:rPr>
@@ -9001,11 +9001,11 @@
             <w:tcW w:type="dxa" w:w="10080"/>
             <w:tcBorders>
               <w:top w:val="none" w:color="FFFFFF" w:sz="0"/>
-              <w:left w:val="single" w:color="4A5059" w:sz="24"/>
+              <w:left w:val="single" w:color="E00000" w:sz="24"/>
               <w:bottom w:val="none" w:color="FFFFFF" w:sz="0"/>
               <w:right w:val="none" w:color="FFFFFF" w:sz="0"/>
             </w:tcBorders>
-            <w:shd w:fill="F2F3F5" w:color="auto" w:val="clear"/>
+            <w:shd w:fill="FFE5E5" w:color="auto" w:val="clear"/>
             <w:tcMar>
               <w:top w:type="dxa" w:w="120"/>
               <w:left w:type="dxa" w:w="180"/>
@@ -9022,12 +9022,12 @@
                 <w:rFonts w:ascii="Arial" w:cs="Arial" w:eastAsia="Arial" w:hAnsi="Arial"/>
                 <w:b/>
                 <w:bCs/>
-                <w:color w:val="4A5059"/>
+                <w:color w:val="E00000"/>
                 <w:spacing w:val="20"/>
                 <w:sz w:val="17"/>
                 <w:szCs w:val="17"/>
               </w:rPr>
-              <w:t xml:space="preserve">GUIDANCE FOR THE DRAFTER · DELETE BEFORE SENDING</w:t>
+              <w:t xml:space="preserve">DRAFT NOTE · DELETE BEFORE SENDING TO CLIENT</w:t>
             </w:r>
           </w:p>
           <w:p>
@@ -9039,7 +9039,7 @@
                 <w:rFonts w:ascii="Arial" w:cs="Arial" w:eastAsia="Arial" w:hAnsi="Arial"/>
                 <w:i/>
                 <w:iCs/>
-                <w:color w:val="4A5059"/>
+                <w:color w:val="E00000"/>
                 <w:sz w:val="19"/>
                 <w:szCs w:val="19"/>
               </w:rPr>
@@ -9969,11 +9969,11 @@
             <w:tcW w:type="dxa" w:w="10080"/>
             <w:tcBorders>
               <w:top w:val="none" w:color="FFFFFF" w:sz="0"/>
-              <w:left w:val="single" w:color="4A5059" w:sz="24"/>
+              <w:left w:val="single" w:color="E00000" w:sz="24"/>
               <w:bottom w:val="none" w:color="FFFFFF" w:sz="0"/>
               <w:right w:val="none" w:color="FFFFFF" w:sz="0"/>
             </w:tcBorders>
-            <w:shd w:fill="F2F3F5" w:color="auto" w:val="clear"/>
+            <w:shd w:fill="FFE5E5" w:color="auto" w:val="clear"/>
             <w:tcMar>
               <w:top w:type="dxa" w:w="120"/>
               <w:left w:type="dxa" w:w="180"/>
@@ -9990,12 +9990,12 @@
                 <w:rFonts w:ascii="Arial" w:cs="Arial" w:eastAsia="Arial" w:hAnsi="Arial"/>
                 <w:b/>
                 <w:bCs/>
-                <w:color w:val="4A5059"/>
+                <w:color w:val="E00000"/>
                 <w:spacing w:val="20"/>
                 <w:sz w:val="17"/>
                 <w:szCs w:val="17"/>
               </w:rPr>
-              <w:t xml:space="preserve">GUIDANCE FOR THE DRAFTER · DELETE BEFORE SENDING</w:t>
+              <w:t xml:space="preserve">DRAFT NOTE · DELETE BEFORE SENDING TO CLIENT</w:t>
             </w:r>
           </w:p>
           <w:p>
@@ -10007,7 +10007,7 @@
                 <w:rFonts w:ascii="Arial" w:cs="Arial" w:eastAsia="Arial" w:hAnsi="Arial"/>
                 <w:i/>
                 <w:iCs/>
-                <w:color w:val="4A5059"/>
+                <w:color w:val="E00000"/>
                 <w:sz w:val="19"/>
                 <w:szCs w:val="19"/>
               </w:rPr>
@@ -11224,11 +11224,11 @@
             <w:tcW w:type="dxa" w:w="10080"/>
             <w:tcBorders>
               <w:top w:val="none" w:color="FFFFFF" w:sz="0"/>
-              <w:left w:val="single" w:color="4A5059" w:sz="24"/>
+              <w:left w:val="single" w:color="E00000" w:sz="24"/>
               <w:bottom w:val="none" w:color="FFFFFF" w:sz="0"/>
               <w:right w:val="none" w:color="FFFFFF" w:sz="0"/>
             </w:tcBorders>
-            <w:shd w:fill="F2F3F5" w:color="auto" w:val="clear"/>
+            <w:shd w:fill="FFE5E5" w:color="auto" w:val="clear"/>
             <w:tcMar>
               <w:top w:type="dxa" w:w="120"/>
               <w:left w:type="dxa" w:w="180"/>
@@ -11245,12 +11245,12 @@
                 <w:rFonts w:ascii="Arial" w:cs="Arial" w:eastAsia="Arial" w:hAnsi="Arial"/>
                 <w:b/>
                 <w:bCs/>
-                <w:color w:val="4A5059"/>
+                <w:color w:val="E00000"/>
                 <w:spacing w:val="20"/>
                 <w:sz w:val="17"/>
                 <w:szCs w:val="17"/>
               </w:rPr>
-              <w:t xml:space="preserve">GUIDANCE FOR THE DRAFTER · DELETE BEFORE SENDING</w:t>
+              <w:t xml:space="preserve">DRAFT NOTE · DELETE BEFORE SENDING TO CLIENT</w:t>
             </w:r>
           </w:p>
           <w:p>
@@ -11262,7 +11262,7 @@
                 <w:rFonts w:ascii="Arial" w:cs="Arial" w:eastAsia="Arial" w:hAnsi="Arial"/>
                 <w:i/>
                 <w:iCs/>
-                <w:color w:val="4A5059"/>
+                <w:color w:val="E00000"/>
                 <w:sz w:val="19"/>
                 <w:szCs w:val="19"/>
               </w:rPr>
@@ -12569,11 +12569,11 @@
             <w:tcW w:type="dxa" w:w="10080"/>
             <w:tcBorders>
               <w:top w:val="none" w:color="FFFFFF" w:sz="0"/>
-              <w:left w:val="single" w:color="4A5059" w:sz="24"/>
+              <w:left w:val="single" w:color="E00000" w:sz="24"/>
               <w:bottom w:val="none" w:color="FFFFFF" w:sz="0"/>
               <w:right w:val="none" w:color="FFFFFF" w:sz="0"/>
             </w:tcBorders>
-            <w:shd w:fill="F2F3F5" w:color="auto" w:val="clear"/>
+            <w:shd w:fill="FFE5E5" w:color="auto" w:val="clear"/>
             <w:tcMar>
               <w:top w:type="dxa" w:w="120"/>
               <w:left w:type="dxa" w:w="180"/>
@@ -12590,12 +12590,12 @@
                 <w:rFonts w:ascii="Arial" w:cs="Arial" w:eastAsia="Arial" w:hAnsi="Arial"/>
                 <w:b/>
                 <w:bCs/>
-                <w:color w:val="4A5059"/>
+                <w:color w:val="E00000"/>
                 <w:spacing w:val="20"/>
                 <w:sz w:val="17"/>
                 <w:szCs w:val="17"/>
               </w:rPr>
-              <w:t xml:space="preserve">GUIDANCE FOR THE DRAFTER · DELETE BEFORE SENDING</w:t>
+              <w:t xml:space="preserve">DRAFT NOTE · DELETE BEFORE SENDING TO CLIENT</w:t>
             </w:r>
           </w:p>
           <w:p>
@@ -12607,7 +12607,7 @@
                 <w:rFonts w:ascii="Arial" w:cs="Arial" w:eastAsia="Arial" w:hAnsi="Arial"/>
                 <w:i/>
                 <w:iCs/>
-                <w:color w:val="4A5059"/>
+                <w:color w:val="E00000"/>
                 <w:sz w:val="19"/>
                 <w:szCs w:val="19"/>
               </w:rPr>
@@ -13144,11 +13144,11 @@
             <w:tcW w:type="dxa" w:w="10080"/>
             <w:tcBorders>
               <w:top w:val="none" w:color="FFFFFF" w:sz="0"/>
-              <w:left w:val="single" w:color="4A5059" w:sz="24"/>
+              <w:left w:val="single" w:color="E00000" w:sz="24"/>
               <w:bottom w:val="none" w:color="FFFFFF" w:sz="0"/>
               <w:right w:val="none" w:color="FFFFFF" w:sz="0"/>
             </w:tcBorders>
-            <w:shd w:fill="F2F3F5" w:color="auto" w:val="clear"/>
+            <w:shd w:fill="FFE5E5" w:color="auto" w:val="clear"/>
             <w:tcMar>
               <w:top w:type="dxa" w:w="120"/>
               <w:left w:type="dxa" w:w="180"/>
@@ -13165,12 +13165,12 @@
                 <w:rFonts w:ascii="Arial" w:cs="Arial" w:eastAsia="Arial" w:hAnsi="Arial"/>
                 <w:b/>
                 <w:bCs/>
-                <w:color w:val="4A5059"/>
+                <w:color w:val="E00000"/>
                 <w:spacing w:val="20"/>
                 <w:sz w:val="17"/>
                 <w:szCs w:val="17"/>
               </w:rPr>
-              <w:t xml:space="preserve">GUIDANCE FOR THE DRAFTER · DELETE BEFORE SENDING</w:t>
+              <w:t xml:space="preserve">DRAFT NOTE · DELETE BEFORE SENDING TO CLIENT</w:t>
             </w:r>
           </w:p>
           <w:p>
@@ -13182,7 +13182,7 @@
                 <w:rFonts w:ascii="Arial" w:cs="Arial" w:eastAsia="Arial" w:hAnsi="Arial"/>
                 <w:i/>
                 <w:iCs/>
-                <w:color w:val="4A5059"/>
+                <w:color w:val="E00000"/>
                 <w:sz w:val="19"/>
                 <w:szCs w:val="19"/>
               </w:rPr>
@@ -13785,11 +13785,11 @@
             <w:tcW w:type="dxa" w:w="10080"/>
             <w:tcBorders>
               <w:top w:val="none" w:color="FFFFFF" w:sz="0"/>
-              <w:left w:val="single" w:color="4A5059" w:sz="24"/>
+              <w:left w:val="single" w:color="E00000" w:sz="24"/>
               <w:bottom w:val="none" w:color="FFFFFF" w:sz="0"/>
               <w:right w:val="none" w:color="FFFFFF" w:sz="0"/>
             </w:tcBorders>
-            <w:shd w:fill="F2F3F5" w:color="auto" w:val="clear"/>
+            <w:shd w:fill="FFE5E5" w:color="auto" w:val="clear"/>
             <w:tcMar>
               <w:top w:type="dxa" w:w="120"/>
               <w:left w:type="dxa" w:w="180"/>
@@ -13806,12 +13806,12 @@
                 <w:rFonts w:ascii="Arial" w:cs="Arial" w:eastAsia="Arial" w:hAnsi="Arial"/>
                 <w:b/>
                 <w:bCs/>
-                <w:color w:val="4A5059"/>
+                <w:color w:val="E00000"/>
                 <w:spacing w:val="20"/>
                 <w:sz w:val="17"/>
                 <w:szCs w:val="17"/>
               </w:rPr>
-              <w:t xml:space="preserve">GUIDANCE FOR THE DRAFTER · DELETE BEFORE SENDING</w:t>
+              <w:t xml:space="preserve">DRAFT NOTE · DELETE BEFORE SENDING TO CLIENT</w:t>
             </w:r>
           </w:p>
           <w:p>
@@ -13823,7 +13823,7 @@
                 <w:rFonts w:ascii="Arial" w:cs="Arial" w:eastAsia="Arial" w:hAnsi="Arial"/>
                 <w:i/>
                 <w:iCs/>
-                <w:color w:val="4A5059"/>
+                <w:color w:val="E00000"/>
                 <w:sz w:val="19"/>
                 <w:szCs w:val="19"/>
               </w:rPr>
@@ -14426,11 +14426,11 @@
             <w:tcW w:type="dxa" w:w="10080"/>
             <w:tcBorders>
               <w:top w:val="none" w:color="FFFFFF" w:sz="0"/>
-              <w:left w:val="single" w:color="4A5059" w:sz="24"/>
+              <w:left w:val="single" w:color="E00000" w:sz="24"/>
               <w:bottom w:val="none" w:color="FFFFFF" w:sz="0"/>
               <w:right w:val="none" w:color="FFFFFF" w:sz="0"/>
             </w:tcBorders>
-            <w:shd w:fill="F2F3F5" w:color="auto" w:val="clear"/>
+            <w:shd w:fill="FFE5E5" w:color="auto" w:val="clear"/>
             <w:tcMar>
               <w:top w:type="dxa" w:w="120"/>
               <w:left w:type="dxa" w:w="180"/>
@@ -14447,12 +14447,12 @@
                 <w:rFonts w:ascii="Arial" w:cs="Arial" w:eastAsia="Arial" w:hAnsi="Arial"/>
                 <w:b/>
                 <w:bCs/>
-                <w:color w:val="4A5059"/>
+                <w:color w:val="E00000"/>
                 <w:spacing w:val="20"/>
                 <w:sz w:val="17"/>
                 <w:szCs w:val="17"/>
               </w:rPr>
-              <w:t xml:space="preserve">GUIDANCE FOR THE DRAFTER · DELETE BEFORE SENDING</w:t>
+              <w:t xml:space="preserve">DRAFT NOTE · DELETE BEFORE SENDING TO CLIENT</w:t>
             </w:r>
           </w:p>
           <w:p>
@@ -14464,7 +14464,7 @@
                 <w:rFonts w:ascii="Arial" w:cs="Arial" w:eastAsia="Arial" w:hAnsi="Arial"/>
                 <w:i/>
                 <w:iCs/>
-                <w:color w:val="4A5059"/>
+                <w:color w:val="E00000"/>
                 <w:sz w:val="19"/>
                 <w:szCs w:val="19"/>
               </w:rPr>
@@ -15001,11 +15001,11 @@
             <w:tcW w:type="dxa" w:w="10080"/>
             <w:tcBorders>
               <w:top w:val="none" w:color="FFFFFF" w:sz="0"/>
-              <w:left w:val="single" w:color="4A5059" w:sz="24"/>
+              <w:left w:val="single" w:color="E00000" w:sz="24"/>
               <w:bottom w:val="none" w:color="FFFFFF" w:sz="0"/>
               <w:right w:val="none" w:color="FFFFFF" w:sz="0"/>
             </w:tcBorders>
-            <w:shd w:fill="F2F3F5" w:color="auto" w:val="clear"/>
+            <w:shd w:fill="FFE5E5" w:color="auto" w:val="clear"/>
             <w:tcMar>
               <w:top w:type="dxa" w:w="120"/>
               <w:left w:type="dxa" w:w="180"/>
@@ -15022,12 +15022,12 @@
                 <w:rFonts w:ascii="Arial" w:cs="Arial" w:eastAsia="Arial" w:hAnsi="Arial"/>
                 <w:b/>
                 <w:bCs/>
-                <w:color w:val="4A5059"/>
+                <w:color w:val="E00000"/>
                 <w:spacing w:val="20"/>
                 <w:sz w:val="17"/>
                 <w:szCs w:val="17"/>
               </w:rPr>
-              <w:t xml:space="preserve">GUIDANCE FOR THE DRAFTER · DELETE BEFORE SENDING</w:t>
+              <w:t xml:space="preserve">DRAFT NOTE · DELETE BEFORE SENDING TO CLIENT</w:t>
             </w:r>
           </w:p>
           <w:p>
@@ -15039,7 +15039,7 @@
                 <w:rFonts w:ascii="Arial" w:cs="Arial" w:eastAsia="Arial" w:hAnsi="Arial"/>
                 <w:i/>
                 <w:iCs/>
-                <w:color w:val="4A5059"/>
+                <w:color w:val="E00000"/>
                 <w:sz w:val="19"/>
                 <w:szCs w:val="19"/>
               </w:rPr>
@@ -16523,11 +16523,11 @@
             <w:tcW w:type="dxa" w:w="10080"/>
             <w:tcBorders>
               <w:top w:val="none" w:color="FFFFFF" w:sz="0"/>
-              <w:left w:val="single" w:color="4A5059" w:sz="24"/>
+              <w:left w:val="single" w:color="E00000" w:sz="24"/>
               <w:bottom w:val="none" w:color="FFFFFF" w:sz="0"/>
               <w:right w:val="none" w:color="FFFFFF" w:sz="0"/>
             </w:tcBorders>
-            <w:shd w:fill="F2F3F5" w:color="auto" w:val="clear"/>
+            <w:shd w:fill="FFE5E5" w:color="auto" w:val="clear"/>
             <w:tcMar>
               <w:top w:type="dxa" w:w="120"/>
               <w:left w:type="dxa" w:w="180"/>
@@ -16544,12 +16544,12 @@
                 <w:rFonts w:ascii="Arial" w:cs="Arial" w:eastAsia="Arial" w:hAnsi="Arial"/>
                 <w:b/>
                 <w:bCs/>
-                <w:color w:val="4A5059"/>
+                <w:color w:val="E00000"/>
                 <w:spacing w:val="20"/>
                 <w:sz w:val="17"/>
                 <w:szCs w:val="17"/>
               </w:rPr>
-              <w:t xml:space="preserve">GUIDANCE FOR THE DRAFTER · DELETE BEFORE SENDING</w:t>
+              <w:t xml:space="preserve">DRAFT NOTE · DELETE BEFORE SENDING TO CLIENT</w:t>
             </w:r>
           </w:p>
           <w:p>
@@ -16561,7 +16561,7 @@
                 <w:rFonts w:ascii="Arial" w:cs="Arial" w:eastAsia="Arial" w:hAnsi="Arial"/>
                 <w:i/>
                 <w:iCs/>
-                <w:color w:val="4A5059"/>
+                <w:color w:val="E00000"/>
                 <w:sz w:val="19"/>
                 <w:szCs w:val="19"/>
               </w:rPr>
@@ -17731,11 +17731,11 @@
             <w:tcW w:type="dxa" w:w="10080"/>
             <w:tcBorders>
               <w:top w:val="none" w:color="FFFFFF" w:sz="0"/>
-              <w:left w:val="single" w:color="4A5059" w:sz="24"/>
+              <w:left w:val="single" w:color="E00000" w:sz="24"/>
               <w:bottom w:val="none" w:color="FFFFFF" w:sz="0"/>
               <w:right w:val="none" w:color="FFFFFF" w:sz="0"/>
             </w:tcBorders>
-            <w:shd w:fill="F2F3F5" w:color="auto" w:val="clear"/>
+            <w:shd w:fill="FFE5E5" w:color="auto" w:val="clear"/>
             <w:tcMar>
               <w:top w:type="dxa" w:w="120"/>
               <w:left w:type="dxa" w:w="180"/>
@@ -17752,12 +17752,12 @@
                 <w:rFonts w:ascii="Arial" w:cs="Arial" w:eastAsia="Arial" w:hAnsi="Arial"/>
                 <w:b/>
                 <w:bCs/>
-                <w:color w:val="4A5059"/>
+                <w:color w:val="E00000"/>
                 <w:spacing w:val="20"/>
                 <w:sz w:val="17"/>
                 <w:szCs w:val="17"/>
               </w:rPr>
-              <w:t xml:space="preserve">GUIDANCE FOR THE DRAFTER · DELETE BEFORE SENDING</w:t>
+              <w:t xml:space="preserve">DRAFT NOTE · DELETE BEFORE SENDING TO CLIENT</w:t>
             </w:r>
           </w:p>
           <w:p>
@@ -17769,7 +17769,7 @@
                 <w:rFonts w:ascii="Arial" w:cs="Arial" w:eastAsia="Arial" w:hAnsi="Arial"/>
                 <w:i/>
                 <w:iCs/>
-                <w:color w:val="4A5059"/>
+                <w:color w:val="E00000"/>
                 <w:sz w:val="19"/>
                 <w:szCs w:val="19"/>
               </w:rPr>

</xml_diff>

<commit_message>
Add Workflow 15 pipeline and outreach quality check to NOIS3 playbook
Co-Authored-By: Claude Opus 5.5 <noreply@anthropic.com>
Claude-Session: https://claude.ai/code/session_01RayYG3bE6Hcjdu95uahmGz
</commit_message>
<xml_diff>
--- a/deliverables/Challenge_Design_Document_Template.docx
+++ b/deliverables/Challenge_Design_Document_Template.docx
@@ -13827,7 +13827,7 @@
                 <w:sz w:val="19"/>
                 <w:szCs w:val="19"/>
               </w:rPr>
-              <w:t xml:space="preserve">Recruit from a named target list. Treat matchmaking as a product when teams need skills from more than one field.</w:t>
+              <w:t xml:space="preserve">Recruit from a named target list. Treat matchmaking as a product when teams need skills from more than one field. Base targets on the ecosystem map and pipeline assumptions (playbook Workflow 15, worksheet A10); the QA lead checks the outreach plan and partners against them before launch.</w:t>
             </w:r>
           </w:p>
         </w:tc>
@@ -14056,7 +14056,7 @@
                 <w:sz w:val="19"/>
                 <w:szCs w:val="19"/>
               </w:rPr>
-              <w:t xml:space="preserve">Channels and partners</w:t>
+              <w:t xml:space="preserve">Ecosystem map and pipeline assumptions (segments, sizes, conversion rates)</w:t>
             </w:r>
           </w:p>
         </w:tc>
@@ -14122,7 +14122,7 @@
                 <w:sz w:val="19"/>
                 <w:szCs w:val="19"/>
               </w:rPr>
-              <w:t xml:space="preserve">Info session (date, speakers)</w:t>
+              <w:t xml:space="preserve">Pipeline targets by segment (agreed with the client)</w:t>
             </w:r>
           </w:p>
         </w:tc>
@@ -14188,7 +14188,7 @@
                 <w:sz w:val="19"/>
                 <w:szCs w:val="19"/>
               </w:rPr>
-              <w:t xml:space="preserve">Technical webinar (date, presenters)</w:t>
+              <w:t xml:space="preserve">Channels and network partners</w:t>
             </w:r>
           </w:p>
         </w:tc>
@@ -14254,7 +14254,7 @@
                 <w:sz w:val="19"/>
                 <w:szCs w:val="19"/>
               </w:rPr>
-              <w:t xml:space="preserve">Matchmaking</w:t>
+              <w:t xml:space="preserve">Info session (date, speakers)</w:t>
             </w:r>
           </w:p>
         </w:tc>
@@ -14320,7 +14320,139 @@
                 <w:sz w:val="19"/>
                 <w:szCs w:val="19"/>
               </w:rPr>
-              <w:t xml:space="preserve">Outreach targets</w:t>
+              <w:t xml:space="preserve">Technical webinar (date, presenters)</w:t>
+            </w:r>
+          </w:p>
+        </w:tc>
+        <w:tc>
+          <w:tcPr>
+            <w:tcW w:type="dxa" w:w="6680"/>
+            <w:tcBorders>
+              <w:top w:val="single" w:color="C9CDD4" w:sz="4"/>
+              <w:left w:val="single" w:color="C9CDD4" w:sz="4"/>
+              <w:bottom w:val="single" w:color="C9CDD4" w:sz="4"/>
+              <w:right w:val="single" w:color="C9CDD4" w:sz="4"/>
+            </w:tcBorders>
+            <w:tcMar>
+              <w:top w:type="dxa" w:w="80"/>
+              <w:left w:type="dxa" w:w="120"/>
+              <w:bottom w:type="dxa" w:w="80"/>
+              <w:right w:type="dxa" w:w="120"/>
+            </w:tcMar>
+          </w:tcPr>
+          <w:p>
+            <w:pPr>
+              <w:spacing w:after="0"/>
+            </w:pPr>
+            <w:r>
+              <w:rPr>
+                <w:rFonts w:ascii="Arial" w:cs="Arial" w:eastAsia="Arial" w:hAnsi="Arial"/>
+                <w:color w:val="4A5059"/>
+                <w:sz w:val="19"/>
+                <w:szCs w:val="19"/>
+              </w:rPr>
+              <w:t xml:space="preserve">[Enter]</w:t>
+            </w:r>
+          </w:p>
+        </w:tc>
+      </w:tr>
+      <w:tr>
+        <w:tc>
+          <w:tcPr>
+            <w:tcW w:type="dxa" w:w="3400"/>
+            <w:tcBorders>
+              <w:top w:val="single" w:color="C9CDD4" w:sz="4"/>
+              <w:left w:val="single" w:color="C9CDD4" w:sz="4"/>
+              <w:bottom w:val="single" w:color="C9CDD4" w:sz="4"/>
+              <w:right w:val="single" w:color="C9CDD4" w:sz="4"/>
+            </w:tcBorders>
+            <w:shd w:fill="F2F3F5" w:color="auto" w:val="clear"/>
+            <w:tcMar>
+              <w:top w:type="dxa" w:w="80"/>
+              <w:left w:type="dxa" w:w="120"/>
+              <w:bottom w:type="dxa" w:w="80"/>
+              <w:right w:type="dxa" w:w="120"/>
+            </w:tcMar>
+          </w:tcPr>
+          <w:p>
+            <w:pPr>
+              <w:spacing w:after="0"/>
+            </w:pPr>
+            <w:r>
+              <w:rPr>
+                <w:rFonts w:ascii="Arial" w:cs="Arial" w:eastAsia="Arial" w:hAnsi="Arial"/>
+                <w:b/>
+                <w:bCs/>
+                <w:sz w:val="19"/>
+                <w:szCs w:val="19"/>
+              </w:rPr>
+              <w:t xml:space="preserve">Matchmaking</w:t>
+            </w:r>
+          </w:p>
+        </w:tc>
+        <w:tc>
+          <w:tcPr>
+            <w:tcW w:type="dxa" w:w="6680"/>
+            <w:tcBorders>
+              <w:top w:val="single" w:color="C9CDD4" w:sz="4"/>
+              <w:left w:val="single" w:color="C9CDD4" w:sz="4"/>
+              <w:bottom w:val="single" w:color="C9CDD4" w:sz="4"/>
+              <w:right w:val="single" w:color="C9CDD4" w:sz="4"/>
+            </w:tcBorders>
+            <w:tcMar>
+              <w:top w:type="dxa" w:w="80"/>
+              <w:left w:type="dxa" w:w="120"/>
+              <w:bottom w:type="dxa" w:w="80"/>
+              <w:right w:type="dxa" w:w="120"/>
+            </w:tcMar>
+          </w:tcPr>
+          <w:p>
+            <w:pPr>
+              <w:spacing w:after="0"/>
+            </w:pPr>
+            <w:r>
+              <w:rPr>
+                <w:rFonts w:ascii="Arial" w:cs="Arial" w:eastAsia="Arial" w:hAnsi="Arial"/>
+                <w:color w:val="4A5059"/>
+                <w:sz w:val="19"/>
+                <w:szCs w:val="19"/>
+              </w:rPr>
+              <w:t xml:space="preserve">[Enter]</w:t>
+            </w:r>
+          </w:p>
+        </w:tc>
+      </w:tr>
+      <w:tr>
+        <w:tc>
+          <w:tcPr>
+            <w:tcW w:type="dxa" w:w="3400"/>
+            <w:tcBorders>
+              <w:top w:val="single" w:color="C9CDD4" w:sz="4"/>
+              <w:left w:val="single" w:color="C9CDD4" w:sz="4"/>
+              <w:bottom w:val="single" w:color="C9CDD4" w:sz="4"/>
+              <w:right w:val="single" w:color="C9CDD4" w:sz="4"/>
+            </w:tcBorders>
+            <w:shd w:fill="F2F3F5" w:color="auto" w:val="clear"/>
+            <w:tcMar>
+              <w:top w:type="dxa" w:w="80"/>
+              <w:left w:type="dxa" w:w="120"/>
+              <w:bottom w:type="dxa" w:w="80"/>
+              <w:right w:type="dxa" w:w="120"/>
+            </w:tcMar>
+          </w:tcPr>
+          <w:p>
+            <w:pPr>
+              <w:spacing w:after="0"/>
+            </w:pPr>
+            <w:r>
+              <w:rPr>
+                <w:rFonts w:ascii="Arial" w:cs="Arial" w:eastAsia="Arial" w:hAnsi="Arial"/>
+                <w:b/>
+                <w:bCs/>
+                <w:sz w:val="19"/>
+                <w:szCs w:val="19"/>
+              </w:rPr>
+              <w:t xml:space="preserve">Weekly triggers for a change of course</w:t>
             </w:r>
           </w:p>
         </w:tc>

</xml_diff>

<commit_message>
Add PM resourcing section: team matrix, PM-held responsibilities and delegation guide
Co-Authored-By: Claude Opus 5.5 <noreply@anthropic.com>
Claude-Session: https://claude.ai/code/session_01RayYG3bE6Hcjdu95uahmGz
</commit_message>
<xml_diff>
--- a/deliverables/Challenge_Design_Document_Template.docx
+++ b/deliverables/Challenge_Design_Document_Template.docx
@@ -16202,7 +16202,7 @@
                 <w:sz w:val="19"/>
                 <w:szCs w:val="19"/>
               </w:rPr>
-              <w:t xml:space="preserve">Runs the challenge; owns the schedule and gates</w:t>
+              <w:t xml:space="preserve">Runs the challenge; owns the client relationship, money, award integrity, scope and gates</w:t>
             </w:r>
           </w:p>
         </w:tc>
@@ -16235,6 +16235,258 @@
                 <w:sz w:val="19"/>
                 <w:szCs w:val="19"/>
               </w:rPr>
+              <w:t xml:space="preserve">Assistant PM (challenge operations)</w:t>
+            </w:r>
+          </w:p>
+        </w:tc>
+        <w:tc>
+          <w:tcPr>
+            <w:tcW w:type="dxa" w:w="1900"/>
+            <w:tcBorders>
+              <w:top w:val="single" w:color="C9CDD4" w:sz="4"/>
+              <w:left w:val="single" w:color="C9CDD4" w:sz="4"/>
+              <w:bottom w:val="single" w:color="C9CDD4" w:sz="4"/>
+              <w:right w:val="single" w:color="C9CDD4" w:sz="4"/>
+            </w:tcBorders>
+            <w:tcMar>
+              <w:top w:type="dxa" w:w="80"/>
+              <w:left w:type="dxa" w:w="120"/>
+              <w:bottom w:type="dxa" w:w="80"/>
+              <w:right w:type="dxa" w:w="120"/>
+            </w:tcMar>
+          </w:tcPr>
+          <w:p>
+            <w:pPr>
+              <w:spacing w:after="0"/>
+            </w:pPr>
+            <w:r>
+              <w:rPr>
+                <w:rFonts w:ascii="Arial" w:cs="Arial" w:eastAsia="Arial" w:hAnsi="Arial"/>
+                <w:color w:val="16181D"/>
+                <w:sz w:val="19"/>
+                <w:szCs w:val="19"/>
+              </w:rPr>
+              <w:t xml:space="preserve">FedTech</w:t>
+            </w:r>
+          </w:p>
+        </w:tc>
+        <w:tc>
+          <w:tcPr>
+            <w:tcW w:type="dxa" w:w="1800"/>
+            <w:tcBorders>
+              <w:top w:val="single" w:color="C9CDD4" w:sz="4"/>
+              <w:left w:val="single" w:color="C9CDD4" w:sz="4"/>
+              <w:bottom w:val="single" w:color="C9CDD4" w:sz="4"/>
+              <w:right w:val="single" w:color="C9CDD4" w:sz="4"/>
+            </w:tcBorders>
+            <w:tcMar>
+              <w:top w:type="dxa" w:w="80"/>
+              <w:left w:type="dxa" w:w="120"/>
+              <w:bottom w:type="dxa" w:w="80"/>
+              <w:right w:type="dxa" w:w="120"/>
+            </w:tcMar>
+          </w:tcPr>
+          <w:p>
+            <w:pPr>
+              <w:spacing w:after="0"/>
+            </w:pPr>
+            <w:r>
+              <w:rPr>
+                <w:rFonts w:ascii="Arial" w:cs="Arial" w:eastAsia="Arial" w:hAnsi="Arial"/>
+                <w:color w:val="16181D"/>
+                <w:sz w:val="19"/>
+                <w:szCs w:val="19"/>
+              </w:rPr>
+              <w:t xml:space="preserve"/>
+            </w:r>
+          </w:p>
+        </w:tc>
+        <w:tc>
+          <w:tcPr>
+            <w:tcW w:type="dxa" w:w="4380"/>
+            <w:tcBorders>
+              <w:top w:val="single" w:color="C9CDD4" w:sz="4"/>
+              <w:left w:val="single" w:color="C9CDD4" w:sz="4"/>
+              <w:bottom w:val="single" w:color="C9CDD4" w:sz="4"/>
+              <w:right w:val="single" w:color="C9CDD4" w:sz="4"/>
+            </w:tcBorders>
+            <w:tcMar>
+              <w:top w:type="dxa" w:w="80"/>
+              <w:left w:type="dxa" w:w="120"/>
+              <w:bottom w:type="dxa" w:w="80"/>
+              <w:right w:type="dxa" w:w="120"/>
+            </w:tcMar>
+          </w:tcPr>
+          <w:p>
+            <w:pPr>
+              <w:spacing w:after="0"/>
+            </w:pPr>
+            <w:r>
+              <w:rPr>
+                <w:rFonts w:ascii="Arial" w:cs="Arial" w:eastAsia="Arial" w:hAnsi="Arial"/>
+                <w:color w:val="16181D"/>
+                <w:sz w:val="19"/>
+                <w:szCs w:val="19"/>
+              </w:rPr>
+              <w:t xml:space="preserve">Platform, inbox, logistics, tracking, agendas and notes</w:t>
+            </w:r>
+          </w:p>
+        </w:tc>
+      </w:tr>
+      <w:tr>
+        <w:tc>
+          <w:tcPr>
+            <w:tcW w:type="dxa" w:w="2000"/>
+            <w:tcBorders>
+              <w:top w:val="single" w:color="C9CDD4" w:sz="4"/>
+              <w:left w:val="single" w:color="C9CDD4" w:sz="4"/>
+              <w:bottom w:val="single" w:color="C9CDD4" w:sz="4"/>
+              <w:right w:val="single" w:color="C9CDD4" w:sz="4"/>
+            </w:tcBorders>
+            <w:tcMar>
+              <w:top w:type="dxa" w:w="80"/>
+              <w:left w:type="dxa" w:w="120"/>
+              <w:bottom w:type="dxa" w:w="80"/>
+              <w:right w:type="dxa" w:w="120"/>
+            </w:tcMar>
+          </w:tcPr>
+          <w:p>
+            <w:pPr>
+              <w:spacing w:after="0"/>
+            </w:pPr>
+            <w:r>
+              <w:rPr>
+                <w:rFonts w:ascii="Arial" w:cs="Arial" w:eastAsia="Arial" w:hAnsi="Arial"/>
+                <w:color w:val="16181D"/>
+                <w:sz w:val="19"/>
+                <w:szCs w:val="19"/>
+              </w:rPr>
+              <w:t xml:space="preserve">Marketing and comms</w:t>
+            </w:r>
+          </w:p>
+        </w:tc>
+        <w:tc>
+          <w:tcPr>
+            <w:tcW w:type="dxa" w:w="1900"/>
+            <w:tcBorders>
+              <w:top w:val="single" w:color="C9CDD4" w:sz="4"/>
+              <w:left w:val="single" w:color="C9CDD4" w:sz="4"/>
+              <w:bottom w:val="single" w:color="C9CDD4" w:sz="4"/>
+              <w:right w:val="single" w:color="C9CDD4" w:sz="4"/>
+            </w:tcBorders>
+            <w:tcMar>
+              <w:top w:type="dxa" w:w="80"/>
+              <w:left w:type="dxa" w:w="120"/>
+              <w:bottom w:type="dxa" w:w="80"/>
+              <w:right w:type="dxa" w:w="120"/>
+            </w:tcMar>
+          </w:tcPr>
+          <w:p>
+            <w:pPr>
+              <w:spacing w:after="0"/>
+            </w:pPr>
+            <w:r>
+              <w:rPr>
+                <w:rFonts w:ascii="Arial" w:cs="Arial" w:eastAsia="Arial" w:hAnsi="Arial"/>
+                <w:color w:val="16181D"/>
+                <w:sz w:val="19"/>
+                <w:szCs w:val="19"/>
+              </w:rPr>
+              <w:t xml:space="preserve">FedTech</w:t>
+            </w:r>
+          </w:p>
+        </w:tc>
+        <w:tc>
+          <w:tcPr>
+            <w:tcW w:type="dxa" w:w="1800"/>
+            <w:tcBorders>
+              <w:top w:val="single" w:color="C9CDD4" w:sz="4"/>
+              <w:left w:val="single" w:color="C9CDD4" w:sz="4"/>
+              <w:bottom w:val="single" w:color="C9CDD4" w:sz="4"/>
+              <w:right w:val="single" w:color="C9CDD4" w:sz="4"/>
+            </w:tcBorders>
+            <w:tcMar>
+              <w:top w:type="dxa" w:w="80"/>
+              <w:left w:type="dxa" w:w="120"/>
+              <w:bottom w:type="dxa" w:w="80"/>
+              <w:right w:type="dxa" w:w="120"/>
+            </w:tcMar>
+          </w:tcPr>
+          <w:p>
+            <w:pPr>
+              <w:spacing w:after="0"/>
+            </w:pPr>
+            <w:r>
+              <w:rPr>
+                <w:rFonts w:ascii="Arial" w:cs="Arial" w:eastAsia="Arial" w:hAnsi="Arial"/>
+                <w:color w:val="16181D"/>
+                <w:sz w:val="19"/>
+                <w:szCs w:val="19"/>
+              </w:rPr>
+              <w:t xml:space="preserve"/>
+            </w:r>
+          </w:p>
+        </w:tc>
+        <w:tc>
+          <w:tcPr>
+            <w:tcW w:type="dxa" w:w="4380"/>
+            <w:tcBorders>
+              <w:top w:val="single" w:color="C9CDD4" w:sz="4"/>
+              <w:left w:val="single" w:color="C9CDD4" w:sz="4"/>
+              <w:bottom w:val="single" w:color="C9CDD4" w:sz="4"/>
+              <w:right w:val="single" w:color="C9CDD4" w:sz="4"/>
+            </w:tcBorders>
+            <w:tcMar>
+              <w:top w:type="dxa" w:w="80"/>
+              <w:left w:type="dxa" w:w="120"/>
+              <w:bottom w:type="dxa" w:w="80"/>
+              <w:right w:type="dxa" w:w="120"/>
+            </w:tcMar>
+          </w:tcPr>
+          <w:p>
+            <w:pPr>
+              <w:spacing w:after="0"/>
+            </w:pPr>
+            <w:r>
+              <w:rPr>
+                <w:rFonts w:ascii="Arial" w:cs="Arial" w:eastAsia="Arial" w:hAnsi="Arial"/>
+                <w:color w:val="16181D"/>
+                <w:sz w:val="19"/>
+                <w:szCs w:val="19"/>
+              </w:rPr>
+              <w:t xml:space="preserve">Outreach, site copy and announcements</w:t>
+            </w:r>
+          </w:p>
+        </w:tc>
+      </w:tr>
+      <w:tr>
+        <w:tc>
+          <w:tcPr>
+            <w:tcW w:type="dxa" w:w="2000"/>
+            <w:tcBorders>
+              <w:top w:val="single" w:color="C9CDD4" w:sz="4"/>
+              <w:left w:val="single" w:color="C9CDD4" w:sz="4"/>
+              <w:bottom w:val="single" w:color="C9CDD4" w:sz="4"/>
+              <w:right w:val="single" w:color="C9CDD4" w:sz="4"/>
+            </w:tcBorders>
+            <w:tcMar>
+              <w:top w:type="dxa" w:w="80"/>
+              <w:left w:type="dxa" w:w="120"/>
+              <w:bottom w:type="dxa" w:w="80"/>
+              <w:right w:type="dxa" w:w="120"/>
+            </w:tcMar>
+          </w:tcPr>
+          <w:p>
+            <w:pPr>
+              <w:spacing w:after="0"/>
+            </w:pPr>
+            <w:r>
+              <w:rPr>
+                <w:rFonts w:ascii="Arial" w:cs="Arial" w:eastAsia="Arial" w:hAnsi="Arial"/>
+                <w:color w:val="16181D"/>
+                <w:sz w:val="19"/>
+                <w:szCs w:val="19"/>
+              </w:rPr>
               <w:t xml:space="preserve">Review lead</w:t>
             </w:r>
           </w:p>
@@ -16329,6 +16581,258 @@
                 <w:szCs w:val="19"/>
               </w:rPr>
               <w:t xml:space="preserve">Runs scoring and reconciliation</w:t>
+            </w:r>
+          </w:p>
+        </w:tc>
+      </w:tr>
+      <w:tr>
+        <w:tc>
+          <w:tcPr>
+            <w:tcW w:type="dxa" w:w="2000"/>
+            <w:tcBorders>
+              <w:top w:val="single" w:color="C9CDD4" w:sz="4"/>
+              <w:left w:val="single" w:color="C9CDD4" w:sz="4"/>
+              <w:bottom w:val="single" w:color="C9CDD4" w:sz="4"/>
+              <w:right w:val="single" w:color="C9CDD4" w:sz="4"/>
+            </w:tcBorders>
+            <w:tcMar>
+              <w:top w:type="dxa" w:w="80"/>
+              <w:left w:type="dxa" w:w="120"/>
+              <w:bottom w:type="dxa" w:w="80"/>
+              <w:right w:type="dxa" w:w="120"/>
+            </w:tcMar>
+          </w:tcPr>
+          <w:p>
+            <w:pPr>
+              <w:spacing w:after="0"/>
+            </w:pPr>
+            <w:r>
+              <w:rPr>
+                <w:rFonts w:ascii="Arial" w:cs="Arial" w:eastAsia="Arial" w:hAnsi="Arial"/>
+                <w:color w:val="16181D"/>
+                <w:sz w:val="19"/>
+                <w:szCs w:val="19"/>
+              </w:rPr>
+              <w:t xml:space="preserve">Internal SMEs</w:t>
+            </w:r>
+          </w:p>
+        </w:tc>
+        <w:tc>
+          <w:tcPr>
+            <w:tcW w:type="dxa" w:w="1900"/>
+            <w:tcBorders>
+              <w:top w:val="single" w:color="C9CDD4" w:sz="4"/>
+              <w:left w:val="single" w:color="C9CDD4" w:sz="4"/>
+              <w:bottom w:val="single" w:color="C9CDD4" w:sz="4"/>
+              <w:right w:val="single" w:color="C9CDD4" w:sz="4"/>
+            </w:tcBorders>
+            <w:tcMar>
+              <w:top w:type="dxa" w:w="80"/>
+              <w:left w:type="dxa" w:w="120"/>
+              <w:bottom w:type="dxa" w:w="80"/>
+              <w:right w:type="dxa" w:w="120"/>
+            </w:tcMar>
+          </w:tcPr>
+          <w:p>
+            <w:pPr>
+              <w:spacing w:after="0"/>
+            </w:pPr>
+            <w:r>
+              <w:rPr>
+                <w:rFonts w:ascii="Arial" w:cs="Arial" w:eastAsia="Arial" w:hAnsi="Arial"/>
+                <w:color w:val="16181D"/>
+                <w:sz w:val="19"/>
+                <w:szCs w:val="19"/>
+              </w:rPr>
+              <w:t xml:space="preserve">FedTech</w:t>
+            </w:r>
+          </w:p>
+        </w:tc>
+        <w:tc>
+          <w:tcPr>
+            <w:tcW w:type="dxa" w:w="1800"/>
+            <w:tcBorders>
+              <w:top w:val="single" w:color="C9CDD4" w:sz="4"/>
+              <w:left w:val="single" w:color="C9CDD4" w:sz="4"/>
+              <w:bottom w:val="single" w:color="C9CDD4" w:sz="4"/>
+              <w:right w:val="single" w:color="C9CDD4" w:sz="4"/>
+            </w:tcBorders>
+            <w:tcMar>
+              <w:top w:type="dxa" w:w="80"/>
+              <w:left w:type="dxa" w:w="120"/>
+              <w:bottom w:type="dxa" w:w="80"/>
+              <w:right w:type="dxa" w:w="120"/>
+            </w:tcMar>
+          </w:tcPr>
+          <w:p>
+            <w:pPr>
+              <w:spacing w:after="0"/>
+            </w:pPr>
+            <w:r>
+              <w:rPr>
+                <w:rFonts w:ascii="Arial" w:cs="Arial" w:eastAsia="Arial" w:hAnsi="Arial"/>
+                <w:color w:val="16181D"/>
+                <w:sz w:val="19"/>
+                <w:szCs w:val="19"/>
+              </w:rPr>
+              <w:t xml:space="preserve"/>
+            </w:r>
+          </w:p>
+        </w:tc>
+        <w:tc>
+          <w:tcPr>
+            <w:tcW w:type="dxa" w:w="4380"/>
+            <w:tcBorders>
+              <w:top w:val="single" w:color="C9CDD4" w:sz="4"/>
+              <w:left w:val="single" w:color="C9CDD4" w:sz="4"/>
+              <w:bottom w:val="single" w:color="C9CDD4" w:sz="4"/>
+              <w:right w:val="single" w:color="C9CDD4" w:sz="4"/>
+            </w:tcBorders>
+            <w:tcMar>
+              <w:top w:type="dxa" w:w="80"/>
+              <w:left w:type="dxa" w:w="120"/>
+              <w:bottom w:type="dxa" w:w="80"/>
+              <w:right w:type="dxa" w:w="120"/>
+            </w:tcMar>
+          </w:tcPr>
+          <w:p>
+            <w:pPr>
+              <w:spacing w:after="0"/>
+            </w:pPr>
+            <w:r>
+              <w:rPr>
+                <w:rFonts w:ascii="Arial" w:cs="Arial" w:eastAsia="Arial" w:hAnsi="Arial"/>
+                <w:color w:val="16181D"/>
+                <w:sz w:val="19"/>
+                <w:szCs w:val="19"/>
+              </w:rPr>
+              <w:t xml:space="preserve">Technical framing, accuracy reviews, webinar content</w:t>
+            </w:r>
+          </w:p>
+        </w:tc>
+      </w:tr>
+      <w:tr>
+        <w:tc>
+          <w:tcPr>
+            <w:tcW w:type="dxa" w:w="2000"/>
+            <w:tcBorders>
+              <w:top w:val="single" w:color="C9CDD4" w:sz="4"/>
+              <w:left w:val="single" w:color="C9CDD4" w:sz="4"/>
+              <w:bottom w:val="single" w:color="C9CDD4" w:sz="4"/>
+              <w:right w:val="single" w:color="C9CDD4" w:sz="4"/>
+            </w:tcBorders>
+            <w:tcMar>
+              <w:top w:type="dxa" w:w="80"/>
+              <w:left w:type="dxa" w:w="120"/>
+              <w:bottom w:type="dxa" w:w="80"/>
+              <w:right w:type="dxa" w:w="120"/>
+            </w:tcMar>
+          </w:tcPr>
+          <w:p>
+            <w:pPr>
+              <w:spacing w:after="0"/>
+            </w:pPr>
+            <w:r>
+              <w:rPr>
+                <w:rFonts w:ascii="Arial" w:cs="Arial" w:eastAsia="Arial" w:hAnsi="Arial"/>
+                <w:color w:val="16181D"/>
+                <w:sz w:val="19"/>
+                <w:szCs w:val="19"/>
+              </w:rPr>
+              <w:t xml:space="preserve">External SMEs and reviewers</w:t>
+            </w:r>
+          </w:p>
+        </w:tc>
+        <w:tc>
+          <w:tcPr>
+            <w:tcW w:type="dxa" w:w="1900"/>
+            <w:tcBorders>
+              <w:top w:val="single" w:color="C9CDD4" w:sz="4"/>
+              <w:left w:val="single" w:color="C9CDD4" w:sz="4"/>
+              <w:bottom w:val="single" w:color="C9CDD4" w:sz="4"/>
+              <w:right w:val="single" w:color="C9CDD4" w:sz="4"/>
+            </w:tcBorders>
+            <w:tcMar>
+              <w:top w:type="dxa" w:w="80"/>
+              <w:left w:type="dxa" w:w="120"/>
+              <w:bottom w:type="dxa" w:w="80"/>
+              <w:right w:type="dxa" w:w="120"/>
+            </w:tcMar>
+          </w:tcPr>
+          <w:p>
+            <w:pPr>
+              <w:spacing w:after="0"/>
+            </w:pPr>
+            <w:r>
+              <w:rPr>
+                <w:rFonts w:ascii="Arial" w:cs="Arial" w:eastAsia="Arial" w:hAnsi="Arial"/>
+                <w:color w:val="4A5059"/>
+                <w:sz w:val="19"/>
+                <w:szCs w:val="19"/>
+              </w:rPr>
+              <w:t xml:space="preserve">[Organizations]</w:t>
+            </w:r>
+          </w:p>
+        </w:tc>
+        <w:tc>
+          <w:tcPr>
+            <w:tcW w:type="dxa" w:w="1800"/>
+            <w:tcBorders>
+              <w:top w:val="single" w:color="C9CDD4" w:sz="4"/>
+              <w:left w:val="single" w:color="C9CDD4" w:sz="4"/>
+              <w:bottom w:val="single" w:color="C9CDD4" w:sz="4"/>
+              <w:right w:val="single" w:color="C9CDD4" w:sz="4"/>
+            </w:tcBorders>
+            <w:tcMar>
+              <w:top w:type="dxa" w:w="80"/>
+              <w:left w:type="dxa" w:w="120"/>
+              <w:bottom w:type="dxa" w:w="80"/>
+              <w:right w:type="dxa" w:w="120"/>
+            </w:tcMar>
+          </w:tcPr>
+          <w:p>
+            <w:pPr>
+              <w:spacing w:after="0"/>
+            </w:pPr>
+            <w:r>
+              <w:rPr>
+                <w:rFonts w:ascii="Arial" w:cs="Arial" w:eastAsia="Arial" w:hAnsi="Arial"/>
+                <w:color w:val="16181D"/>
+                <w:sz w:val="19"/>
+                <w:szCs w:val="19"/>
+              </w:rPr>
+              <w:t xml:space="preserve"/>
+            </w:r>
+          </w:p>
+        </w:tc>
+        <w:tc>
+          <w:tcPr>
+            <w:tcW w:type="dxa" w:w="4380"/>
+            <w:tcBorders>
+              <w:top w:val="single" w:color="C9CDD4" w:sz="4"/>
+              <w:left w:val="single" w:color="C9CDD4" w:sz="4"/>
+              <w:bottom w:val="single" w:color="C9CDD4" w:sz="4"/>
+              <w:right w:val="single" w:color="C9CDD4" w:sz="4"/>
+            </w:tcBorders>
+            <w:tcMar>
+              <w:top w:type="dxa" w:w="80"/>
+              <w:left w:type="dxa" w:w="120"/>
+              <w:bottom w:type="dxa" w:w="80"/>
+              <w:right w:type="dxa" w:w="120"/>
+            </w:tcMar>
+          </w:tcPr>
+          <w:p>
+            <w:pPr>
+              <w:spacing w:after="0"/>
+            </w:pPr>
+            <w:r>
+              <w:rPr>
+                <w:rFonts w:ascii="Arial" w:cs="Arial" w:eastAsia="Arial" w:hAnsi="Arial"/>
+                <w:color w:val="16181D"/>
+                <w:sz w:val="19"/>
+                <w:szCs w:val="19"/>
+              </w:rPr>
+              <w:t xml:space="preserve">Score entries; advise; conflict-screened each stage</w:t>
             </w:r>
           </w:p>
         </w:tc>

</xml_diff>